<commit_message>
fix(templates): bo dau moc + tach DC/DCSX tren bao gia Ngoc Han
- Go anh con dau khoi o header (chi con lai trong zip nhung khong con
  duoc tham chieu).
- Thay {{ company_address }} bang 2 dong cung:
  DC:   Ap 3, Xa Tan Phuoc 1, Tinh Dong Thap
  DCSX: 5/10 Nguyen Thi Pha, Ap 29, Xa Dong Thanh, TP. Ho Chi Minh
  Dinh dang sao theo dong DT/MST (nhan dam, Times New Roman 13pt).

Luu y: template nay khong con doc company_address tu DB. Doi dia chi
sau nay phai sua file, khong sua duoc trong Cai dat cong ty.

Co-Authored-By: Claude Opus 5 <noreply@anthropic.com>
</commit_message>
<xml_diff>
--- a/app/uploads/templates/SOFA-NGOCHAN/quotation_2d1aefda.docx
+++ b/app/uploads/templates/SOFA-NGOCHAN/quotation_2d1aefda.docx
@@ -96,9 +96,24 @@
                 <w:color w:val="000000" w:themeColor="text1" w:themeTint="FF" w:themeShade="FF"/>
                 <w:sz w:val="20"/>
                 <w:szCs w:val="20"/>
+              </w:rPr>
+            </w:pPr>
+            <w:r>
+              <w:rPr>
+                <w:rFonts w:ascii="Times New Roman" w:hAnsi="Times New Roman" w:eastAsia="Times New Roman" w:cs="Times New Roman"/>
+                <w:b w:val="1"/>
+                <w:bCs w:val="1"/>
+                <w:i w:val="0"/>
+                <w:iCs w:val="0"/>
+                <w:caps w:val="0"/>
+                <w:smallCaps w:val="0"/>
+                <w:color w:val="000000" w:themeColor="text1" w:themeTint="FF" w:themeShade="FF"/>
+                <w:sz w:val="26"/>
+                <w:szCs w:val="20"/>
                 <w:lang w:val="vi"/>
               </w:rPr>
-            </w:pPr>
+              <w:t>ĐC</w:t>
+            </w:r>
             <w:r>
               <w:rPr>
                 <w:rFonts w:ascii="Times New Roman" w:hAnsi="Times New Roman" w:eastAsia="Times New Roman" w:cs="Times New Roman"/>
@@ -113,72 +128,63 @@
                 <w:szCs w:val="20"/>
                 <w:lang w:val="vi"/>
               </w:rPr>
-              <w:t>{{ company_address }}</w:t>
+              <w:t>: Ấp 3, Xã Tân Phước 1, Tỉnh Đồng Tháp</w:t>
+            </w:r>
+          </w:p>
+          <w:p>
+            <w:pPr>
+              <w:pStyle w:val="Header"/>
+              <w:tabs>
+                <w:tab w:val="center" w:leader="none" w:pos="4680"/>
+                <w:tab w:val="right" w:leader="none" w:pos="9360"/>
+              </w:tabs>
+              <w:bidi w:val="0"/>
+              <w:spacing w:line="240" w:lineRule="auto"/>
+              <w:jc w:val="center"/>
+              <w:rPr>
+                <w:rFonts w:ascii="Times New Roman" w:hAnsi="Times New Roman" w:eastAsia="Times New Roman" w:cs="Times New Roman"/>
+                <w:b w:val="0"/>
+                <w:bCs w:val="0"/>
+                <w:i w:val="0"/>
+                <w:iCs w:val="0"/>
+                <w:caps w:val="0"/>
+                <w:smallCaps w:val="0"/>
+                <w:color w:val="000000" w:themeColor="text1" w:themeTint="FF" w:themeShade="FF"/>
+                <w:sz w:val="20"/>
+                <w:szCs w:val="20"/>
+              </w:rPr>
+            </w:pPr>
+            <w:r>
+              <w:rPr>
+                <w:rFonts w:ascii="Times New Roman" w:hAnsi="Times New Roman" w:eastAsia="Times New Roman" w:cs="Times New Roman"/>
+                <w:b w:val="1"/>
+                <w:bCs w:val="1"/>
+                <w:i w:val="0"/>
+                <w:iCs w:val="0"/>
+                <w:caps w:val="0"/>
+                <w:smallCaps w:val="0"/>
+                <w:color w:val="000000" w:themeColor="text1" w:themeTint="FF" w:themeShade="FF"/>
+                <w:sz w:val="26"/>
+                <w:szCs w:val="20"/>
+                <w:lang w:val="vi"/>
+              </w:rPr>
+              <w:t>ĐCSX</w:t>
             </w:r>
             <w:r>
               <w:rPr>
-                <w:rFonts w:ascii="Times New Roman" w:hAnsi="Times New Roman" w:eastAsia="Times New Roman"/>
+                <w:rFonts w:ascii="Times New Roman" w:hAnsi="Times New Roman" w:eastAsia="Times New Roman" w:cs="Times New Roman"/>
+                <w:b w:val="0"/>
+                <w:bCs w:val="0"/>
+                <w:i w:val="0"/>
+                <w:iCs w:val="0"/>
+                <w:caps w:val="0"/>
+                <w:smallCaps w:val="0"/>
+                <w:color w:val="000000" w:themeColor="text1" w:themeTint="FF" w:themeShade="FF"/>
+                <w:sz w:val="26"/>
+                <w:szCs w:val="20"/>
+                <w:lang w:val="vi"/>
               </w:rPr>
-              <w:drawing>
-                <wp:anchor distT="0" distB="0" distL="114300" distR="114300" simplePos="0" relativeHeight="251659264" behindDoc="1" locked="0" layoutInCell="1" allowOverlap="1" wp14:anchorId="1C1FA185" wp14:editId="2C3911BD">
-                  <wp:simplePos x="0" y="0"/>
-                  <wp:positionH relativeFrom="column">
-                    <wp:posOffset>28575</wp:posOffset>
-                  </wp:positionH>
-                  <wp:positionV relativeFrom="paragraph">
-                    <wp:posOffset>133350</wp:posOffset>
-                  </wp:positionV>
-                  <wp:extent cx="1420495" cy="1322705"/>
-                  <wp:effectExtent l="0" t="0" r="8255" b="0"/>
-                  <wp:wrapNone/>
-                  <wp:docPr id="4" name="Picture 4"/>
-                  <wp:cNvGraphicFramePr>
-                    <a:graphicFrameLocks noChangeAspect="1"/>
-                  </wp:cNvGraphicFramePr>
-                  <a:graphic>
-                    <a:graphicData xmlns:a="http://schemas.openxmlformats.org/drawingml/2006/main" uri="http://schemas.openxmlformats.org/drawingml/2006/picture">
-                      <pic:pic xmlns:pic="http://schemas.openxmlformats.org/drawingml/2006/picture">
-                        <pic:nvPicPr xmlns:pic="http://schemas.openxmlformats.org/drawingml/2006/picture">
-                          <pic:cNvPr xmlns:pic="http://schemas.openxmlformats.org/drawingml/2006/picture" id="4" name="Picture 4"/>
-                          <pic:cNvPicPr xmlns:pic="http://schemas.openxmlformats.org/drawingml/2006/picture"/>
-                        </pic:nvPicPr>
-                        <pic:blipFill xmlns:pic="http://schemas.openxmlformats.org/drawingml/2006/picture">
-                          <a:blip xmlns:r="http://schemas.openxmlformats.org/officeDocument/2006/relationships" xmlns:a="http://schemas.openxmlformats.org/drawingml/2006/main" r:embed="rId9">
-                            <a:extLst xmlns:a="http://schemas.openxmlformats.org/drawingml/2006/main">
-                              <a:ext xmlns:a="http://schemas.openxmlformats.org/drawingml/2006/main" uri="{28A0092B-C50C-407E-A947-70E740481C1C}">
-                                <a14:useLocalDpi xmlns:a14="http://schemas.microsoft.com/office/drawing/2010/main" val="0"/>
-                              </a:ext>
-                            </a:extLst>
-                          </a:blip>
-                          <a:stretch xmlns:a="http://schemas.openxmlformats.org/drawingml/2006/main">
-                            <a:fillRect xmlns:a="http://schemas.openxmlformats.org/drawingml/2006/main"/>
-                          </a:stretch>
-                        </pic:blipFill>
-                        <pic:spPr xmlns:pic="http://schemas.openxmlformats.org/drawingml/2006/picture">
-                          <a:xfrm xmlns:a="http://schemas.openxmlformats.org/drawingml/2006/main">
-                            <a:off xmlns:a="http://schemas.openxmlformats.org/drawingml/2006/main" x="0" y="0"/>
-                            <a:ext xmlns:a="http://schemas.openxmlformats.org/drawingml/2006/main" cx="1420495" cy="1322705"/>
-                          </a:xfrm>
-                          <a:prstGeom xmlns:a="http://schemas.openxmlformats.org/drawingml/2006/main" prst="rect">
-                            <a:avLst xmlns:a="http://schemas.openxmlformats.org/drawingml/2006/main"/>
-                          </a:prstGeom>
-                          <a:effectLst xmlns:a="http://schemas.openxmlformats.org/drawingml/2006/main">
-                            <a:outerShdw xmlns:a="http://schemas.openxmlformats.org/drawingml/2006/main" blurRad="50800" dist="50800" dir="5400000" sx="64000" sy="64000" algn="ctr" rotWithShape="0">
-                              <a:schemeClr xmlns:a="http://schemas.openxmlformats.org/drawingml/2006/main" val="bg1"/>
-                            </a:outerShdw>
-                          </a:effectLst>
-                        </pic:spPr>
-                      </pic:pic>
-                    </a:graphicData>
-                  </a:graphic>
-                  <wp14:sizeRelH relativeFrom="page">
-                    <wp14:pctWidth>0</wp14:pctWidth>
-                  </wp14:sizeRelH>
-                  <wp14:sizeRelV relativeFrom="page">
-                    <wp14:pctHeight>0</wp14:pctHeight>
-                  </wp14:sizeRelV>
-                </wp:anchor>
-              </w:drawing>
+              <w:t>: 5/10 Nguyễn Thị Pha, Ấp 29, Xã Đông Thạnh, TP. Hồ Chí Minh</w:t>
             </w:r>
           </w:p>
           <w:p>

</xml_diff>